<commit_message>
Refactor: Update UI/UX analysis document
Co-authored-by: pm <pm@inspire.com.sa>
</commit_message>
<xml_diff>
--- a/OQFoundation_UI_UX_Analysis.docx
+++ b/OQFoundation_UI_UX_Analysis.docx
@@ -418,6 +418,107 @@
         <w:t>Polish copy (typos, spacing) and implement any stylized text via CSS.</w:t>
       </w:r>
     </w:p>
+    <w:p>
+      <w:r>
+        <w:br w:type="page"/>
+      </w:r>
+    </w:p>
+    <w:p>
+      <w:r>
+        <w:rPr>
+          <w:b/>
+          <w:sz w:val="32"/>
+        </w:rPr>
+        <w:t>Addendum: First-time load performance observation</w:t>
+      </w:r>
+    </w:p>
+    <w:p>
+      <w:r>
+        <w:t>Observation: On the first visit (cold cache), the site can feel noticeably slower to load and become interactive. Subsequent visits may feel faster due to browser caching.</w:t>
+      </w:r>
+    </w:p>
+    <w:p>
+      <w:r>
+        <w:t>Likely contributors (common on WordPress sites with multiple plugins/assets):</w:t>
+      </w:r>
+    </w:p>
+    <w:p>
+      <w:pPr>
+        <w:pStyle w:val="ListBullet"/>
+      </w:pPr>
+      <w:r>
+        <w:t>Many CSS/JS files on initial load (theme + plugins + third-party scripts).</w:t>
+      </w:r>
+    </w:p>
+    <w:p>
+      <w:pPr>
+        <w:pStyle w:val="ListBullet"/>
+      </w:pPr>
+      <w:r>
+        <w:t>Large hero/section imagery that may not be fully optimized for first paint.</w:t>
+      </w:r>
+    </w:p>
+    <w:p>
+      <w:pPr>
+        <w:pStyle w:val="ListBullet"/>
+      </w:pPr>
+      <w:r>
+        <w:t>Third-party scripts (e.g., cookie consent) adding network and main-thread work.</w:t>
+      </w:r>
+    </w:p>
+    <w:p>
+      <w:pPr>
+        <w:pStyle w:val="ListBullet"/>
+      </w:pPr>
+      <w:r>
+        <w:t>Limited use of deferring/critical-loading patterns for non-essential JavaScript.</w:t>
+      </w:r>
+    </w:p>
+    <w:p>
+      <w:r>
+        <w:t>Recommended actions to improve first-load performance:</w:t>
+      </w:r>
+    </w:p>
+    <w:p>
+      <w:pPr>
+        <w:pStyle w:val="ListBullet"/>
+      </w:pPr>
+      <w:r>
+        <w:t>Defer/async non-critical JavaScript; delay third-party scripts until after consent/interaction where possible.</w:t>
+      </w:r>
+    </w:p>
+    <w:p>
+      <w:pPr>
+        <w:pStyle w:val="ListBullet"/>
+      </w:pPr>
+      <w:r>
+        <w:t>Reduce plugin payload (remove unused plugins/assets, prevent loading plugin CSS/JS site-wide if only used on some pages).</w:t>
+      </w:r>
+    </w:p>
+    <w:p>
+      <w:pPr>
+        <w:pStyle w:val="ListBullet"/>
+      </w:pPr>
+      <w:r>
+        <w:t>Optimize images (modern formats like WebP/AVIF, correct sizes, responsive srcset, lazy-load below-the-fold).</w:t>
+      </w:r>
+    </w:p>
+    <w:p>
+      <w:pPr>
+        <w:pStyle w:val="ListBullet"/>
+      </w:pPr>
+      <w:r>
+        <w:t>Inline critical CSS for above-the-fold and load the rest asynchronously (or via a performance plugin/build step).</w:t>
+      </w:r>
+    </w:p>
+    <w:p>
+      <w:pPr>
+        <w:pStyle w:val="ListBullet"/>
+      </w:pPr>
+      <w:r>
+        <w:t>Review caching/CDN settings (full-page caching where appropriate; long cache headers for versioned assets).</w:t>
+      </w:r>
+    </w:p>
     <w:sectPr>
       <w:pgSz w:w="12240" w:h="15840"/>
       <w:pgMar w:top="1440" w:right="1800" w:bottom="1440" w:left="1800" w:header="720" w:footer="720" w:gutter="0"/>

</xml_diff>